<commit_message>
fix: enhance shading patterns with additional thin variants and improve test coverage
</commit_message>
<xml_diff>
--- a/test-files/shading-patterns.docx
+++ b/test-files/shading-patterns.docx
@@ -98,6 +98,40 @@
         </w:tc>
         <w:tc>
           <w:tcPr>
+            <w:shd w:val="thinVertStripe" w:color="990099" w:fill="FFEEFF"/>
+          </w:tcPr>
+          <w:p/>
+        </w:tc>
+        <w:tc>
+          <w:tcPr>
+            <w:shd w:val="thinDiagStripe" w:color="AA00AA" w:fill="EEDDFF"/>
+          </w:tcPr>
+          <w:p/>
+        </w:tc>
+      </w:tr>
+      <w:tr>
+        <w:tc>
+          <w:tcPr>
+            <w:shd w:val="thinReverseDiagStripe" w:color="BB00BB" w:fill="DDEEFF"/>
+          </w:tcPr>
+          <w:p/>
+        </w:tc>
+        <w:tc>
+          <w:tcPr>
+            <w:shd w:val="thinHorzCross" w:color="CC00CC" w:fill="EEFFFF"/>
+          </w:tcPr>
+          <w:p/>
+        </w:tc>
+        <w:tc>
+          <w:tcPr>
+            <w:shd w:val="thinDiagCross" w:color="DD00DD" w:fill="FFFFEE"/>
+          </w:tcPr>
+          <w:p/>
+        </w:tc>
+      </w:tr>
+      <w:tr>
+        <w:tc>
+          <w:tcPr>
             <w:shd w:val="clear" w:color="auto" w:fill="F0F0F1"/>
           </w:tcPr>
           <w:p/>
@@ -112,6 +146,12 @@
             </w:r>
           </w:p>
         </w:tc>
+        <w:tc>
+          <w:tcPr>
+            <w:shd w:val="clear" w:color="auto" w:fill="F0F0F3"/>
+          </w:tcPr>
+          <w:p/>
+        </w:tc>
       </w:tr>
     </w:tbl>
     <w:p/>

</xml_diff>